<commit_message>
docs(w9/M2.1 L3): 把 bootstrap CI + OOD enrichment + 多seed 整合进 v0.3 文档
learned-governance(英/中):R2/R3 加 CI 区间、新增 OOD-enrichment 段(OR 74.7,超越 OOD 标签)、Limitations 改写(配对差值不跨0)、Evidence sources 加 2 行。data-inventory:§7A 加稳健性/OOD 子表、§9 缺口 CI+多seed 标已补、§10 下一步更新。中文 docx 同步重生成。

Co-Authored-By: Claude Opus 4.8 <noreply@anthropic.com>
</commit_message>
<xml_diff>
--- a/docs/paper/v0.3/learned-governance-zh.docx
+++ b/docs/paper/v0.3/learned-governance-zh.docx
@@ -1758,6 +1758,155 @@
         <w:t xml:space="preserve">。因为这些是留出折预测，所以这是泛化结果，不是记忆。</w:t>
       </w:r>
     </w:p>
+    <w:p>
+      <w:pPr>
+        <w:pStyle w:val="BodyText"/>
+      </w:pPr>
+      <w:r>
+        <w:rPr>
+          <w:rFonts w:hint="eastAsia"/>
+        </w:rPr>
+        <w:t xml:space="preserve">在扰动级</w:t>
+      </w:r>
+      <w:r>
+        <w:t xml:space="preserve"> bootstrap </w:t>
+      </w:r>
+      <w:r>
+        <w:rPr>
+          <w:rFonts w:hint="eastAsia"/>
+        </w:rPr>
+        <w:t xml:space="preserve">重采样（B</w:t>
+      </w:r>
+      <w:r>
+        <w:t xml:space="preserve"> = </w:t>
+      </w:r>
+      <w:r>
+        <w:rPr>
+          <w:rFonts w:hint="eastAsia"/>
+        </w:rPr>
+        <w:t xml:space="preserve">2000）下，可学习</w:t>
+      </w:r>
+      <w:r>
+        <w:t xml:space="preserve"> − </w:t>
+      </w:r>
+      <w:r>
+        <w:rPr>
+          <w:rFonts w:hint="eastAsia"/>
+        </w:rPr>
+        <w:t xml:space="preserve">仅分歧</w:t>
+      </w:r>
+      <w:r>
+        <w:t xml:space="preserve"> </w:t>
+      </w:r>
+      <w:r>
+        <w:rPr>
+          <w:rFonts w:hint="eastAsia"/>
+        </w:rPr>
+        <w:t xml:space="preserve">的配对</w:t>
+      </w:r>
+      <w:r>
+        <w:t xml:space="preserve"> AUROC </w:t>
+      </w:r>
+      <w:r>
+        <w:rPr>
+          <w:rFonts w:hint="eastAsia"/>
+        </w:rPr>
+        <w:t xml:space="preserve">差不跨</w:t>
+      </w:r>
+      <w:r>
+        <w:t xml:space="preserve"> </w:t>
+      </w:r>
+      <w:r>
+        <w:rPr>
+          <w:rFonts w:hint="eastAsia"/>
+        </w:rPr>
+        <w:t xml:space="preserve">0：</w:t>
+      </w:r>
+      <w:r>
+        <w:rPr>
+          <w:rFonts w:hint="eastAsia"/>
+          <w:b/>
+          <w:bCs/>
+        </w:rPr>
+        <w:t xml:space="preserve">+0.13，95%</w:t>
+      </w:r>
+      <w:r>
+        <w:rPr>
+          <w:b/>
+          <w:bCs/>
+        </w:rPr>
+        <w:t xml:space="preserve"> CI [0.056, 0.191]</w:t>
+      </w:r>
+      <w:r>
+        <w:rPr>
+          <w:rFonts w:hint="eastAsia"/>
+        </w:rPr>
+        <w:t xml:space="preserve">。在此</w:t>
+      </w:r>
+      <w:r>
+        <w:t xml:space="preserve"> ledger </w:t>
+      </w:r>
+      <w:r>
+        <w:rPr>
+          <w:rFonts w:hint="eastAsia"/>
+        </w:rPr>
+        <w:t xml:space="preserve">规模下单点</w:t>
+      </w:r>
+      <w:r>
+        <w:t xml:space="preserve"> AUROC </w:t>
+      </w:r>
+      <w:r>
+        <w:rPr>
+          <w:rFonts w:hint="eastAsia"/>
+        </w:rPr>
+        <w:t xml:space="preserve">的区间较宽（0.907，95%</w:t>
+      </w:r>
+      <w:r>
+        <w:t xml:space="preserve"> CI [0.846, </w:t>
+      </w:r>
+      <w:r>
+        <w:rPr>
+          <w:rFonts w:hint="eastAsia"/>
+        </w:rPr>
+        <w:t xml:space="preserve">0.952]），故我们强调配对优势而非单点绝对值。在</w:t>
+      </w:r>
+      <w:r>
+        <w:t xml:space="preserve"> 5 </w:t>
+      </w:r>
+      <w:r>
+        <w:rPr>
+          <w:rFonts w:hint="eastAsia"/>
+        </w:rPr>
+        <w:t xml:space="preserve">个随机留扰动划分下，可学习</w:t>
+      </w:r>
+      <w:r>
+        <w:t xml:space="preserve"> AUROC </w:t>
+      </w:r>
+      <w:r>
+        <w:rPr>
+          <w:rFonts w:hint="eastAsia"/>
+        </w:rPr>
+        <w:t xml:space="preserve">稳定在</w:t>
+      </w:r>
+      <w:r>
+        <w:t xml:space="preserve"> 0.900 ± </w:t>
+      </w:r>
+      <w:r>
+        <w:rPr>
+          <w:rFonts w:hint="eastAsia"/>
+        </w:rPr>
+        <w:t xml:space="preserve">0.008（范围</w:t>
+      </w:r>
+      <w:r>
+        <w:t xml:space="preserve"> </w:t>
+      </w:r>
+      <w:r>
+        <w:rPr>
+          <w:rFonts w:hint="eastAsia"/>
+        </w:rPr>
+        <w:t xml:space="preserve">0.885–0.907），每个划分都高于仅分歧（0.774）。</w:t>
+      </w:r>
+    </w:p>
     <w:bookmarkEnd w:id="12"/>
     <w:bookmarkStart w:id="13" w:name="r3.-可学习弃权压过基于规则的弃权oof升级-v0.2-表-c"/>
     <w:p>
@@ -2153,7 +2302,288 @@
         <w:rPr>
           <w:rFonts w:hint="eastAsia"/>
         </w:rPr>
-        <w:t xml:space="preserve">上界（我们报告该上界以避免过度宣称）。</w:t>
+        <w:t xml:space="preserve">上界（我们报告该上界以避免过度宣称）。可学习</w:t>
+      </w:r>
+      <w:r>
+        <w:t xml:space="preserve"> − </w:t>
+      </w:r>
+      <w:r>
+        <w:rPr>
+          <w:rFonts w:hint="eastAsia"/>
+        </w:rPr>
+        <w:t xml:space="preserve">仅分歧</w:t>
+      </w:r>
+      <w:r>
+        <w:t xml:space="preserve"> </w:t>
+      </w:r>
+      <w:r>
+        <w:rPr>
+          <w:rFonts w:hint="eastAsia"/>
+        </w:rPr>
+        <w:t xml:space="preserve">的配对</w:t>
+      </w:r>
+      <w:r>
+        <w:t xml:space="preserve"> risk–coverage AUC </w:t>
+      </w:r>
+      <w:r>
+        <w:rPr>
+          <w:rFonts w:hint="eastAsia"/>
+        </w:rPr>
+        <w:t xml:space="preserve">差在</w:t>
+      </w:r>
+      <w:r>
+        <w:t xml:space="preserve"> bootstrap </w:t>
+      </w:r>
+      <w:r>
+        <w:rPr>
+          <w:rFonts w:hint="eastAsia"/>
+        </w:rPr>
+        <w:t xml:space="preserve">下稳健:</w:t>
+      </w:r>
+      <w:r>
+        <w:rPr>
+          <w:rFonts w:hint="eastAsia"/>
+          <w:b/>
+          <w:bCs/>
+        </w:rPr>
+        <w:t xml:space="preserve">+0.026，95%</w:t>
+      </w:r>
+      <w:r>
+        <w:rPr>
+          <w:b/>
+          <w:bCs/>
+        </w:rPr>
+        <w:t xml:space="preserve"> CI [0.014, 0.041]</w:t>
+      </w:r>
+      <w:r>
+        <w:rPr>
+          <w:rFonts w:hint="eastAsia"/>
+        </w:rPr>
+        <w:t xml:space="preserve">（B</w:t>
+      </w:r>
+      <w:r>
+        <w:t xml:space="preserve"> = </w:t>
+      </w:r>
+      <w:r>
+        <w:rPr>
+          <w:rFonts w:hint="eastAsia"/>
+        </w:rPr>
+        <w:t xml:space="preserve">2000），且在全部</w:t>
+      </w:r>
+      <w:r>
+        <w:t xml:space="preserve"> 5 </w:t>
+      </w:r>
+      <w:r>
+        <w:rPr>
+          <w:rFonts w:hint="eastAsia"/>
+        </w:rPr>
+        <w:t xml:space="preserve">个随机划分下成立（可学习</w:t>
+      </w:r>
+      <w:r>
+        <w:t xml:space="preserve"> 0.744 ± 0.001 vs </w:t>
+      </w:r>
+      <w:r>
+        <w:rPr>
+          <w:rFonts w:hint="eastAsia"/>
+        </w:rPr>
+        <w:t xml:space="preserve">仅分歧</w:t>
+      </w:r>
+      <w:r>
+        <w:t xml:space="preserve"> </w:t>
+      </w:r>
+      <w:r>
+        <w:rPr>
+          <w:rFonts w:hint="eastAsia"/>
+        </w:rPr>
+        <w:t xml:space="preserve">0.720）。</w:t>
+      </w:r>
+    </w:p>
+    <w:p>
+      <w:pPr>
+        <w:pStyle w:val="BodyText"/>
+      </w:pPr>
+      <w:r>
+        <w:rPr>
+          <w:rFonts w:hint="eastAsia"/>
+          <w:b/>
+          <w:bCs/>
+        </w:rPr>
+        <w:t xml:space="preserve">可学习策略弃权在什么扰动上。</w:t>
+      </w:r>
+      <w:r>
+        <w:t xml:space="preserve"> </w:t>
+      </w:r>
+      <w:r>
+        <w:rPr>
+          <w:rFonts w:hint="eastAsia"/>
+        </w:rPr>
+        <w:t xml:space="preserve">可学习弃权偏好标记未见/分布外（OOD）扰动:被标记的扰动里</w:t>
+      </w:r>
+      <w:r>
+        <w:t xml:space="preserve"> 98% </w:t>
+      </w:r>
+      <w:r>
+        <w:rPr>
+          <w:rFonts w:hint="eastAsia"/>
+        </w:rPr>
+        <w:t xml:space="preserve">是</w:t>
+      </w:r>
+      <w:r>
+        <w:t xml:space="preserve"> </w:t>
+      </w:r>
+      <w:r>
+        <w:rPr>
+          <w:rFonts w:hint="eastAsia"/>
+        </w:rPr>
+        <w:t xml:space="preserve">OOD（富集</w:t>
+      </w:r>
+      <w:r>
+        <w:t xml:space="preserve"> odds ratio </w:t>
+      </w:r>
+      <w:r>
+        <w:rPr>
+          <w:rFonts w:hint="eastAsia"/>
+        </w:rPr>
+        <w:t xml:space="preserve">74.7，base</w:t>
+      </w:r>
+      <w:r>
+        <w:t xml:space="preserve"> rate </w:t>
+      </w:r>
+      <w:r>
+        <w:rPr>
+          <w:rFonts w:hint="eastAsia"/>
+        </w:rPr>
+        <w:t xml:space="preserve">仅</w:t>
+      </w:r>
+      <w:r>
+        <w:t xml:space="preserve"> </w:t>
+      </w:r>
+      <w:r>
+        <w:rPr>
+          <w:rFonts w:hint="eastAsia"/>
+        </w:rPr>
+        <w:t xml:space="preserve">0.54），与”OOD</w:t>
+      </w:r>
+      <w:r>
+        <w:t xml:space="preserve"> </w:t>
+      </w:r>
+      <w:r>
+        <w:rPr>
+          <w:rFonts w:hint="eastAsia"/>
+        </w:rPr>
+        <w:t xml:space="preserve">扰动准度更低”一致（平均</w:t>
+      </w:r>
+      <w:r>
+        <w:t xml:space="preserve"> Δ-Pearson 0.51 vs seen </w:t>
+      </w:r>
+      <w:r>
+        <w:rPr>
+          <w:rFonts w:hint="eastAsia"/>
+        </w:rPr>
+        <w:t xml:space="preserve">的</w:t>
+      </w:r>
+      <w:r>
+        <w:t xml:space="preserve"> </w:t>
+      </w:r>
+      <w:r>
+        <w:rPr>
+          <w:rFonts w:hint="eastAsia"/>
+        </w:rPr>
+        <w:t xml:space="preserve">0.83）。但它</w:t>
+      </w:r>
+      <w:r>
+        <w:rPr>
+          <w:rFonts w:hint="eastAsia"/>
+          <w:b/>
+          <w:bCs/>
+        </w:rPr>
+        <w:t xml:space="preserve">不是</w:t>
+      </w:r>
+      <w:r>
+        <w:t xml:space="preserve"> </w:t>
+      </w:r>
+      <w:r>
+        <w:t xml:space="preserve">OOD </w:t>
+      </w:r>
+      <w:r>
+        <w:rPr>
+          <w:rFonts w:hint="eastAsia"/>
+        </w:rPr>
+        <w:t xml:space="preserve">标签的简单代理——在</w:t>
+      </w:r>
+      <w:r>
+        <w:t xml:space="preserve"> OOD-only </w:t>
+      </w:r>
+      <w:r>
+        <w:rPr>
+          <w:rFonts w:hint="eastAsia"/>
+        </w:rPr>
+        <w:t xml:space="preserve">子集内（OOD</w:t>
+      </w:r>
+      <w:r>
+        <w:t xml:space="preserve"> </w:t>
+      </w:r>
+      <w:r>
+        <w:rPr>
+          <w:rFonts w:hint="eastAsia"/>
+        </w:rPr>
+        <w:t xml:space="preserve">标签恒定），可学习可靠性仍能为选择性弃权排序（risk–coverage</w:t>
+      </w:r>
+      <w:r>
+        <w:t xml:space="preserve"> AUC 0.577 &gt; </w:t>
+      </w:r>
+      <w:r>
+        <w:rPr>
+          <w:rFonts w:hint="eastAsia"/>
+        </w:rPr>
+        <w:t xml:space="preserve">0.5），且可学习检测器在</w:t>
+      </w:r>
+      <w:r>
+        <w:t xml:space="preserve"> </w:t>
+      </w:r>
+      <w:r>
+        <w:rPr>
+          <w:rFonts w:hint="eastAsia"/>
+        </w:rPr>
+        <w:t xml:space="preserve">bad-扰动检测上超过仅-OOD</w:t>
+      </w:r>
+      <w:r>
+        <w:t xml:space="preserve"> </w:t>
+      </w:r>
+      <w:r>
+        <w:rPr>
+          <w:rFonts w:hint="eastAsia"/>
+        </w:rPr>
+        <w:t xml:space="preserve">启发式（AUROC</w:t>
+      </w:r>
+      <w:r>
+        <w:t xml:space="preserve"> 0.907 vs </w:t>
+      </w:r>
+      <w:r>
+        <w:rPr>
+          <w:rFonts w:hint="eastAsia"/>
+        </w:rPr>
+        <w:t xml:space="preserve">0.788）。因此可学习头抓住的是</w:t>
+      </w:r>
+      <w:r>
+        <w:rPr>
+          <w:rFonts w:hint="eastAsia"/>
+          <w:b/>
+          <w:bCs/>
+        </w:rPr>
+        <w:t xml:space="preserve">超越</w:t>
+      </w:r>
+      <w:r>
+        <w:t xml:space="preserve"> </w:t>
+      </w:r>
+      <w:r>
+        <w:t xml:space="preserve">OOD </w:t>
+      </w:r>
+      <w:r>
+        <w:rPr>
+          <w:rFonts w:hint="eastAsia"/>
+        </w:rPr>
+        <w:t xml:space="preserve">状态本身的低准度扰动。</w:t>
       </w:r>
     </w:p>
     <w:bookmarkEnd w:id="13"/>
@@ -4706,7 +5136,7 @@
           <w:b/>
           <w:bCs/>
         </w:rPr>
-        <w:t xml:space="preserve">小样本，无置信区间。</w:t>
+        <w:t xml:space="preserve">小样本。</w:t>
       </w:r>
       <w:r>
         <w:t xml:space="preserve"> </w:t>
@@ -4727,7 +5157,61 @@
         <w:rPr>
           <w:rFonts w:hint="eastAsia"/>
         </w:rPr>
-        <w:t xml:space="preserve">个扰动、单一确定性</w:t>
+        <w:t xml:space="preserve">个扰动。我们量化由此带来的不确定性而非回避:在扰动级</w:t>
+      </w:r>
+      <w:r>
+        <w:t xml:space="preserve"> </w:t>
+      </w:r>
+      <w:r>
+        <w:rPr>
+          <w:rFonts w:hint="eastAsia"/>
+        </w:rPr>
+        <w:t xml:space="preserve">bootstrap（B</w:t>
+      </w:r>
+      <w:r>
+        <w:t xml:space="preserve"> = </w:t>
+      </w:r>
+      <w:r>
+        <w:rPr>
+          <w:rFonts w:hint="eastAsia"/>
+        </w:rPr>
+        <w:t xml:space="preserve">2000）下，配对的”可学习</w:t>
+      </w:r>
+      <w:r>
+        <w:t xml:space="preserve"> vs </w:t>
+      </w:r>
+      <w:r>
+        <w:rPr>
+          <w:rFonts w:hint="eastAsia"/>
+        </w:rPr>
+        <w:t xml:space="preserve">baseline”差不跨</w:t>
+      </w:r>
+      <w:r>
+        <w:t xml:space="preserve"> </w:t>
+      </w:r>
+      <w:r>
+        <w:rPr>
+          <w:rFonts w:hint="eastAsia"/>
+        </w:rPr>
+        <w:t xml:space="preserve">0（AUROC</w:t>
+      </w:r>
+      <w:r>
+        <w:t xml:space="preserve"> +0.13 [0.056, </w:t>
+      </w:r>
+      <w:r>
+        <w:rPr>
+          <w:rFonts w:hint="eastAsia"/>
+        </w:rPr>
+        <w:t xml:space="preserve">0.191]；risk–coverage</w:t>
+      </w:r>
+      <w:r>
+        <w:t xml:space="preserve"> AUC +0.026 [0.014, </w:t>
+      </w:r>
+      <w:r>
+        <w:rPr>
+          <w:rFonts w:hint="eastAsia"/>
+        </w:rPr>
+        <w:t xml:space="preserve">0.041]），且该优势在</w:t>
       </w:r>
       <w:r>
         <w:t xml:space="preserve"> 5 </w:t>
@@ -4736,52 +5220,34 @@
         <w:rPr>
           <w:rFonts w:hint="eastAsia"/>
         </w:rPr>
-        <w:t xml:space="preserve">折；我们未报告</w:t>
-      </w:r>
-      <w:r>
-        <w:t xml:space="preserve"> bootstrap </w:t>
-      </w:r>
-      <w:r>
-        <w:rPr>
-          <w:rFonts w:hint="eastAsia"/>
-        </w:rPr>
-        <w:t xml:space="preserve">置信区间。跨折</w:t>
-      </w:r>
-      <w:r>
-        <w:t xml:space="preserve"> OOF </w:t>
-      </w:r>
-      <w:r>
-        <w:rPr>
-          <w:rFonts w:hint="eastAsia"/>
-        </w:rPr>
-        <w:t xml:space="preserve">的差距（0.907</w:t>
-      </w:r>
-      <w:r>
-        <w:t xml:space="preserve"> vs </w:t>
-      </w:r>
-      <w:r>
-        <w:rPr>
-          <w:rFonts w:hint="eastAsia"/>
-        </w:rPr>
-        <w:t xml:space="preserve">0.774；0.746</w:t>
-      </w:r>
-      <w:r>
-        <w:t xml:space="preserve"> vs </w:t>
-      </w:r>
-      <w:r>
-        <w:rPr>
-          <w:rFonts w:hint="eastAsia"/>
-        </w:rPr>
-        <w:t xml:space="preserve">0.720）很清晰但没有区间；对招牌数字做扰动级</w:t>
-      </w:r>
-      <w:r>
-        <w:t xml:space="preserve"> bootstrap CI </w:t>
-      </w:r>
-      <w:r>
-        <w:rPr>
-          <w:rFonts w:hint="eastAsia"/>
-        </w:rPr>
-        <w:t xml:space="preserve">是一项干净的、已计划的强化。</w:t>
+        <w:t xml:space="preserve">个随机划分下都成立——但单点</w:t>
+      </w:r>
+      <w:r>
+        <w:t xml:space="preserve"> AUC </w:t>
+      </w:r>
+      <w:r>
+        <w:rPr>
+          <w:rFonts w:hint="eastAsia"/>
+        </w:rPr>
+        <w:t xml:space="preserve">的区间较宽（如</w:t>
+      </w:r>
+      <w:r>
+        <w:t xml:space="preserve"> AUROC 0.907 [0.846, </w:t>
+      </w:r>
+      <w:r>
+        <w:rPr>
+          <w:rFonts w:hint="eastAsia"/>
+        </w:rPr>
+        <w:t xml:space="preserve">0.952]），故我们强调配对优势而非单点绝对值。更大的</w:t>
+      </w:r>
+      <w:r>
+        <w:t xml:space="preserve"> ledger </w:t>
+      </w:r>
+      <w:r>
+        <w:rPr>
+          <w:rFonts w:hint="eastAsia"/>
+        </w:rPr>
+        <w:t xml:space="preserve">会收紧单点区间。</w:t>
       </w:r>
     </w:p>
     <w:p>
@@ -5703,6 +6169,111 @@
                 <w:rStyle w:val="VerbatimChar"/>
               </w:rPr>
               <w:t xml:space="preserve">docs/findings/finding_w9_m2_router_oracle.md</w:t>
+            </w:r>
+          </w:p>
+        </w:tc>
+      </w:tr>
+      <w:tr>
+        <w:tc>
+          <w:tcPr/>
+          <w:p>
+            <w:pPr>
+              <w:pStyle w:val="Compact"/>
+            </w:pPr>
+            <w:r>
+              <w:t xml:space="preserve">bootstrap </w:t>
+            </w:r>
+            <w:r>
+              <w:rPr>
+                <w:rFonts w:hint="eastAsia"/>
+              </w:rPr>
+              <w:t xml:space="preserve">CI（AUROC/AUC</w:t>
+            </w:r>
+            <w:r>
+              <w:t xml:space="preserve"> </w:t>
+            </w:r>
+            <w:r>
+              <w:rPr>
+                <w:rFonts w:hint="eastAsia"/>
+              </w:rPr>
+              <w:t xml:space="preserve">配对差不跨</w:t>
+            </w:r>
+            <w:r>
+              <w:t xml:space="preserve"> </w:t>
+            </w:r>
+            <w:r>
+              <w:rPr>
+                <w:rFonts w:hint="eastAsia"/>
+              </w:rPr>
+              <w:t xml:space="preserve">0）；多</w:t>
+            </w:r>
+            <w:r>
+              <w:t xml:space="preserve"> seed </w:t>
+            </w:r>
+            <w:r>
+              <w:rPr>
+                <w:rFonts w:hint="eastAsia"/>
+              </w:rPr>
+              <w:t xml:space="preserve">重复</w:t>
+            </w:r>
+            <w:r>
+              <w:t xml:space="preserve"> CV </w:t>
+            </w:r>
+            <w:r>
+              <w:rPr>
+                <w:rFonts w:hint="eastAsia"/>
+              </w:rPr>
+              <w:t xml:space="preserve">稳定</w:t>
+            </w:r>
+          </w:p>
+        </w:tc>
+        <w:tc>
+          <w:tcPr/>
+          <w:p>
+            <w:pPr>
+              <w:pStyle w:val="Compact"/>
+            </w:pPr>
+            <w:r>
+              <w:rPr>
+                <w:rStyle w:val="VerbatimChar"/>
+              </w:rPr>
+              <w:t xml:space="preserve">docs/findings/finding_w9_m2_bootstrap_ci.md</w:t>
+            </w:r>
+          </w:p>
+        </w:tc>
+      </w:tr>
+      <w:tr>
+        <w:tc>
+          <w:tcPr/>
+          <w:p>
+            <w:pPr>
+              <w:pStyle w:val="Compact"/>
+            </w:pPr>
+            <w:r>
+              <w:t xml:space="preserve">OOD enrichment OR </w:t>
+            </w:r>
+            <w:r>
+              <w:rPr>
+                <w:rFonts w:hint="eastAsia"/>
+              </w:rPr>
+              <w:t xml:space="preserve">74.7；OOD-only/seen-only</w:t>
+            </w:r>
+            <w:r>
+              <w:t xml:space="preserve"> risk-cov 0.577/0.861</w:t>
+            </w:r>
+          </w:p>
+        </w:tc>
+        <w:tc>
+          <w:tcPr/>
+          <w:p>
+            <w:pPr>
+              <w:pStyle w:val="Compact"/>
+            </w:pPr>
+            <w:r>
+              <w:rPr>
+                <w:rStyle w:val="VerbatimChar"/>
+              </w:rPr>
+              <w:t xml:space="preserve">docs/findings/finding_w9_m2_ood_enrichment.md</w:t>
             </w:r>
           </w:p>
         </w:tc>

</xml_diff>